<commit_message>
feat: ship secure teaching-case workflow and PPT export
</commit_message>
<xml_diff>
--- a/docs/CaseAutoGenSystem-产品需求PRD.docx
+++ b/docs/CaseAutoGenSystem-产品需求PRD.docx
@@ -22,113 +22,15 @@
         <w:pStyle w:val="BlockText"/>
       </w:pPr>
       <w:r>
-        <w:rPr>
-          <w:rFonts w:hint="eastAsia"/>
-          <w:b/>
-          <w:bCs/>
-        </w:rPr>
-        <w:t xml:space="preserve">文档版本</w:t>
-      </w:r>
-      <w:r>
-        <w:rPr>
-          <w:rFonts w:hint="eastAsia"/>
-        </w:rPr>
-        <w:t xml:space="preserve">：v2.0</w:t>
-      </w:r>
-      <w:r>
+        <w:t>文档版本：v3.0</w:t>
         <w:br/>
-      </w:r>
-      <w:r>
-        <w:rPr>
-          <w:rFonts w:hint="eastAsia"/>
-          <w:b/>
-          <w:bCs/>
-        </w:rPr>
-        <w:t xml:space="preserve">编制视角</w:t>
-      </w:r>
-      <w:r>
-        <w:rPr>
-          <w:rFonts w:hint="eastAsia"/>
-        </w:rPr>
-        <w:t xml:space="preserve">：AI</w:t>
-      </w:r>
-      <w:r>
-        <w:t xml:space="preserve"> </w:t>
-      </w:r>
-      <w:r>
-        <w:rPr>
-          <w:rFonts w:hint="eastAsia"/>
-        </w:rPr>
-        <w:t xml:space="preserve">产品经理</w:t>
-      </w:r>
-      <w:r>
+        <w:t>编制视角：AI 产品经理</w:t>
         <w:br/>
-      </w:r>
-      <w:r>
-        <w:rPr>
-          <w:rFonts w:hint="eastAsia"/>
-          <w:b/>
-          <w:bCs/>
-        </w:rPr>
-        <w:t xml:space="preserve">产品名称</w:t>
-      </w:r>
-      <w:r>
-        <w:rPr>
-          <w:rFonts w:hint="eastAsia"/>
-        </w:rPr>
-        <w:t xml:space="preserve">：CaseAutoGenSystem</w:t>
-      </w:r>
-      <w:r>
-        <w:t xml:space="preserve"> — AutoGen </w:t>
-      </w:r>
-      <w:r>
-        <w:rPr>
-          <w:rFonts w:hint="eastAsia"/>
-        </w:rPr>
-        <w:t xml:space="preserve">教学案例自动生成系统</w:t>
-      </w:r>
-      <w:r>
+        <w:t>产品名称：CaseAutoGenSystem — AutoGen 教学案例自动生成系统</w:t>
         <w:br/>
-      </w:r>
-      <w:r>
-        <w:rPr>
-          <w:rFonts w:hint="eastAsia"/>
-          <w:b/>
-          <w:bCs/>
-        </w:rPr>
-        <w:t xml:space="preserve">目标用户</w:t>
-      </w:r>
-      <w:r>
-        <w:rPr>
-          <w:rFonts w:hint="eastAsia"/>
-        </w:rPr>
-        <w:t xml:space="preserve">：高校教师、培训师、教研人员</w:t>
-      </w:r>
-      <w:r>
+        <w:t>目标用户：高校教师、培训师、教研人员</w:t>
         <w:br/>
-      </w:r>
-      <w:r>
-        <w:rPr>
-          <w:rFonts w:hint="eastAsia"/>
-          <w:b/>
-          <w:bCs/>
-        </w:rPr>
-        <w:t xml:space="preserve">技术核心</w:t>
-      </w:r>
-      <w:r>
-        <w:rPr>
-          <w:rFonts w:hint="eastAsia"/>
-        </w:rPr>
-        <w:t xml:space="preserve">：Microsoft</w:t>
-      </w:r>
-      <w:r>
-        <w:t xml:space="preserve"> AutoGen </w:t>
-      </w:r>
-      <w:r>
-        <w:rPr>
-          <w:rFonts w:hint="eastAsia"/>
-        </w:rPr>
-        <w:t xml:space="preserve">多智能体协作生成</w:t>
+        <w:t>技术核心：YAML 驱动五 Agent + Application Skills + 质量门禁</w:t>
       </w:r>
     </w:p>
     <w:p>
@@ -490,19 +392,7 @@
               <w:pStyle w:val="Compact"/>
             </w:pPr>
             <w:r>
-              <w:rPr>
-                <w:rFonts w:hint="eastAsia"/>
-              </w:rPr>
-              <w:t xml:space="preserve">案例库版本管理</w:t>
-            </w:r>
-            <w:r>
-              <w:t xml:space="preserve"> + </w:t>
-            </w:r>
-            <w:r>
-              <w:rPr>
-                <w:rFonts w:hint="eastAsia"/>
-              </w:rPr>
-              <w:t xml:space="preserve">局部再生成</w:t>
+              <w:t>案例库版本管理 + 人工编辑 + 教学目标换一组</w:t>
             </w:r>
           </w:p>
         </w:tc>
@@ -772,19 +662,7 @@
         <w:pStyle w:val="BodyText"/>
       </w:pPr>
       <w:r>
-        <w:rPr>
-          <w:rFonts w:hint="eastAsia"/>
-        </w:rPr>
-        <w:t xml:space="preserve">可选扩展：PPT</w:t>
-      </w:r>
-      <w:r>
-        <w:t xml:space="preserve"> </w:t>
-      </w:r>
-      <w:r>
-        <w:rPr>
-          <w:rFonts w:hint="eastAsia"/>
-        </w:rPr>
-        <w:t xml:space="preserve">授课要点、课堂活动方案、延伸阅读建议。</w:t>
+        <w:t>PPTX 课堂课件已纳入正式上线范围，可在 WPS/PowerPoint 中继续编辑。</w:t>
       </w:r>
     </w:p>
     <w:p>
@@ -3525,28 +3403,7 @@
         </w:numPr>
       </w:pPr>
       <w:r>
-        <w:rPr>
-          <w:rFonts w:hint="eastAsia"/>
-        </w:rPr>
-        <w:t xml:space="preserve">「仅重跑</w:t>
-      </w:r>
-      <w:r>
-        <w:t xml:space="preserve"> Pedagogy </w:t>
-      </w:r>
-      <w:r>
-        <w:rPr>
-          <w:rFonts w:hint="eastAsia"/>
-        </w:rPr>
-        <w:t xml:space="preserve">Agent」「仅重跑</w:t>
-      </w:r>
-      <w:r>
-        <w:t xml:space="preserve"> </w:t>
-      </w:r>
-      <w:r>
-        <w:rPr>
-          <w:rFonts w:hint="eastAsia"/>
-        </w:rPr>
-        <w:t xml:space="preserve">Reviewer」等局部再生成</w:t>
+        <w:t>统一编辑保存并递增版本；不提供Skill 运行追踪，避免四件套上下文错配</w:t>
       </w:r>
     </w:p>
     <w:p>
@@ -3986,13 +3843,7 @@
               <w:pStyle w:val="Compact"/>
             </w:pPr>
             <w:r>
-              <w:t xml:space="preserve">Word + PDF </w:t>
-            </w:r>
-            <w:r>
-              <w:rPr>
-                <w:rFonts w:hint="eastAsia"/>
-              </w:rPr>
-              <w:t xml:space="preserve">导出合计</w:t>
+              <w:t>Word + PDF + PPTX 导出合计</w:t>
             </w:r>
           </w:p>
         </w:tc>
@@ -4131,56 +3982,29 @@
               <w:pStyle w:val="Compact"/>
             </w:pPr>
             <w:r>
-              <w:rPr>
-                <w:rFonts w:hint="eastAsia"/>
-              </w:rPr>
-              <w:t xml:space="preserve">局部</w:t>
-            </w:r>
-            <w:r>
-              <w:t xml:space="preserve"> Agent </w:t>
-            </w:r>
-            <w:r>
-              <w:rPr>
-                <w:rFonts w:hint="eastAsia"/>
-              </w:rPr>
-              <w:t xml:space="preserve">重跑</w:t>
-            </w:r>
-          </w:p>
-        </w:tc>
-        <w:tc>
-          <w:tcPr/>
-          <w:p>
-            <w:pPr>
-              <w:pStyle w:val="Compact"/>
-            </w:pPr>
-            <w:r>
-              <w:rPr>
-                <w:rFonts w:hint="eastAsia"/>
-              </w:rPr>
-              <w:t xml:space="preserve">人机协同迭代次数</w:t>
-            </w:r>
-          </w:p>
-        </w:tc>
-        <w:tc>
-          <w:tcPr/>
-          <w:p>
-            <w:pPr>
-              <w:pStyle w:val="Compact"/>
-            </w:pPr>
-            <w:r>
-              <w:rPr>
-                <w:rFonts w:hint="eastAsia"/>
-              </w:rPr>
-              <w:t xml:space="preserve">重跑</w:t>
-            </w:r>
-            <w:r>
-              <w:t xml:space="preserve"> API </w:t>
-            </w:r>
-            <w:r>
-              <w:rPr>
-                <w:rFonts w:hint="eastAsia"/>
-              </w:rPr>
-              <w:t xml:space="preserve">调用计数</w:t>
+              <w:t>Skill 运行追踪</w:t>
+            </w:r>
+          </w:p>
+        </w:tc>
+        <w:tc>
+          <w:tcPr/>
+          <w:p>
+            <w:pPr>
+              <w:pStyle w:val="Compact"/>
+            </w:pPr>
+            <w:r>
+              <w:t>各 Agent 加载 Skill 的可追溯记录</w:t>
+            </w:r>
+          </w:p>
+        </w:tc>
+        <w:tc>
+          <w:tcPr/>
+          <w:p>
+            <w:pPr>
+              <w:pStyle w:val="Compact"/>
+            </w:pPr>
+            <w:r>
+              <w:t>meta.skill_trace</w:t>
             </w:r>
           </w:p>
         </w:tc>
@@ -4787,19 +4611,29 @@
               <w:pStyle w:val="Compact"/>
             </w:pPr>
             <w:r>
-              <w:rPr>
-                <w:rFonts w:hint="eastAsia"/>
-              </w:rPr>
-              <w:t xml:space="preserve">基于</w:t>
-            </w:r>
-            <w:r>
-              <w:t xml:space="preserve"> Word </w:t>
-            </w:r>
-            <w:r>
-              <w:rPr>
-                <w:rFonts w:hint="eastAsia"/>
-              </w:rPr>
-              <w:t xml:space="preserve">渲染或独立排版，适合打印与只读提交</w:t>
+              <w:t>独立中文排版，适合打印、归档与只读提交</w:t>
+            </w:r>
+          </w:p>
+        </w:tc>
+      </w:tr>
+      <w:tr>
+        <w:tc>
+          <w:tcPr>
+            <w:tcW w:type="dxa" w:w="3960"/>
+          </w:tcPr>
+          <w:p>
+            <w:r>
+              <w:t>PPTX (.pptx)</w:t>
+            </w:r>
+          </w:p>
+        </w:tc>
+        <w:tc>
+          <w:tcPr>
+            <w:tcW w:type="dxa" w:w="3960"/>
+          </w:tcPr>
+          <w:p>
+            <w:r>
+              <w:t>按教学节奏重组为可编辑课件；支持三种主题、三种密度、教师/学生版和目录预览</w:t>
             </w:r>
           </w:p>
         </w:tc>
@@ -5457,42 +5291,18 @@
               <w:pStyle w:val="Compact"/>
             </w:pPr>
             <w:r>
-              <w:rPr>
-                <w:rFonts w:hint="eastAsia"/>
-              </w:rPr>
-              <w:t xml:space="preserve">局部</w:t>
-            </w:r>
-            <w:r>
-              <w:t xml:space="preserve"> Agent </w:t>
-            </w:r>
-            <w:r>
-              <w:rPr>
-                <w:rFonts w:hint="eastAsia"/>
-              </w:rPr>
-              <w:t xml:space="preserve">重跑</w:t>
-            </w:r>
-          </w:p>
-        </w:tc>
-        <w:tc>
-          <w:tcPr/>
-          <w:p>
-            <w:pPr>
-              <w:pStyle w:val="Compact"/>
-            </w:pPr>
-            <w:r>
-              <w:rPr>
-                <w:rFonts w:hint="eastAsia"/>
-              </w:rPr>
-              <w:t xml:space="preserve">教师仅重跑</w:t>
-            </w:r>
-            <w:r>
-              <w:t xml:space="preserve"> Pedagogy / </w:t>
-            </w:r>
-            <w:r>
-              <w:rPr>
-                <w:rFonts w:hint="eastAsia"/>
-              </w:rPr>
-              <w:t xml:space="preserve">Reviewer，无需全流程</w:t>
+              <w:t>Skill 运行追踪</w:t>
+            </w:r>
+          </w:p>
+        </w:tc>
+        <w:tc>
+          <w:tcPr/>
+          <w:p>
+            <w:pPr>
+              <w:pStyle w:val="Compact"/>
+            </w:pPr>
+            <w:r>
+              <w:t>记录各 Agent 加载的 Skill 名称与版本</w:t>
             </w:r>
           </w:p>
         </w:tc>
@@ -5676,108 +5486,7 @@
         <w:pStyle w:val="FirstParagraph"/>
       </w:pPr>
       <w:r>
-        <w:rPr>
-          <w:rFonts w:hint="eastAsia"/>
-        </w:rPr>
-        <w:t xml:space="preserve">教师</w:t>
-      </w:r>
-      <w:r>
-        <w:rPr>
-          <w:rFonts w:hint="eastAsia"/>
-          <w:b/>
-          <w:bCs/>
-        </w:rPr>
-        <w:t xml:space="preserve">不能</w:t>
-      </w:r>
-      <w:r>
-        <w:rPr>
-          <w:rFonts w:hint="eastAsia"/>
-        </w:rPr>
-        <w:t xml:space="preserve">改</w:t>
-      </w:r>
-      <w:r>
-        <w:t xml:space="preserve"> Prompt </w:t>
-      </w:r>
-      <w:r>
-        <w:rPr>
-          <w:rFonts w:hint="eastAsia"/>
-        </w:rPr>
-        <w:t xml:space="preserve">与模型，仅可：</w:t>
-      </w:r>
-      <w:r>
-        <w:t xml:space="preserve"> </w:t>
-      </w:r>
-      <w:r>
-        <w:t xml:space="preserve">- </w:t>
-      </w:r>
-      <w:r>
-        <w:rPr>
-          <w:rFonts w:hint="eastAsia"/>
-        </w:rPr>
-        <w:t xml:space="preserve">选择编排模板（标准流水线</w:t>
-      </w:r>
-      <w:r>
-        <w:t xml:space="preserve"> / </w:t>
-      </w:r>
-      <w:r>
-        <w:rPr>
-          <w:rFonts w:hint="eastAsia"/>
-        </w:rPr>
-        <w:t xml:space="preserve">深度评审）</w:t>
-      </w:r>
-      <w:r>
-        <w:t xml:space="preserve"> </w:t>
-      </w:r>
-      <w:r>
-        <w:t xml:space="preserve">- </w:t>
-      </w:r>
-      <w:r>
-        <w:rPr>
-          <w:rFonts w:hint="eastAsia"/>
-        </w:rPr>
-        <w:t xml:space="preserve">选择学科（触发学科插件）</w:t>
-      </w:r>
-      <w:r>
-        <w:t xml:space="preserve"> </w:t>
-      </w:r>
-      <w:r>
-        <w:t xml:space="preserve">- </w:t>
-      </w:r>
-      <w:r>
-        <w:rPr>
-          <w:rFonts w:hint="eastAsia"/>
-        </w:rPr>
-        <w:t xml:space="preserve">在案例详情页触发局部</w:t>
-      </w:r>
-      <w:r>
-        <w:t xml:space="preserve"> Agent </w:t>
-      </w:r>
-      <w:r>
-        <w:rPr>
-          <w:rFonts w:hint="eastAsia"/>
-        </w:rPr>
-        <w:t xml:space="preserve">重跑</w:t>
-      </w:r>
-      <w:r>
-        <w:t xml:space="preserve"> </w:t>
-      </w:r>
-      <w:r>
-        <w:t xml:space="preserve">- </w:t>
-      </w:r>
-      <w:r>
-        <w:rPr>
-          <w:rFonts w:hint="eastAsia"/>
-        </w:rPr>
-        <w:t xml:space="preserve">开关是否查看</w:t>
-      </w:r>
-      <w:r>
-        <w:t xml:space="preserve"> Agent </w:t>
-      </w:r>
-      <w:r>
-        <w:rPr>
-          <w:rFonts w:hint="eastAsia"/>
-        </w:rPr>
-        <w:t xml:space="preserve">协作日志</w:t>
+        <w:t>教师不能改 Prompt 与模型，仅可： - 选择编排模板（标准流水线 / 深度评审） - 选择学科（触发学科插件） - 在案例详情页触发Skill 运行追踪 - 开关是否查看 Agent 协作日志</w:t>
       </w:r>
     </w:p>
     <w:p>
@@ -7830,22 +7539,7 @@
               <w:pStyle w:val="Compact"/>
             </w:pPr>
             <w:r>
-              <w:t xml:space="preserve">JWT </w:t>
-            </w:r>
-            <w:r>
-              <w:rPr>
-                <w:rFonts w:hint="eastAsia"/>
-              </w:rPr>
-              <w:t xml:space="preserve">认证；案例数据隔离；API</w:t>
-            </w:r>
-            <w:r>
-              <w:t xml:space="preserve"> Key </w:t>
-            </w:r>
-            <w:r>
-              <w:rPr>
-                <w:rFonts w:hint="eastAsia"/>
-              </w:rPr>
-              <w:t xml:space="preserve">环境变量</w:t>
+              <w:t>邮箱注册；密码哈希；短时 Access Token；HttpOnly Refresh Cookie；案例数据隔离；公网 HTTPS</w:t>
             </w:r>
           </w:p>
         </w:tc>
@@ -8116,13 +7810,7 @@
               <w:pStyle w:val="Compact"/>
             </w:pPr>
             <w:r>
-              <w:t xml:space="preserve">P02 </w:t>
-            </w:r>
-            <w:r>
-              <w:rPr>
-                <w:rFonts w:hint="eastAsia"/>
-              </w:rPr>
-              <w:t xml:space="preserve">登录</w:t>
+              <w:t>P02 登录/注册</w:t>
             </w:r>
           </w:p>
         </w:tc>
@@ -8147,10 +7835,7 @@
               <w:pStyle w:val="Compact"/>
             </w:pPr>
             <w:r>
-              <w:rPr>
-                <w:rFonts w:hint="eastAsia"/>
-              </w:rPr>
-              <w:t xml:space="preserve">教师账号</w:t>
+              <w:t>邮箱注册、登录与安全会话</w:t>
             </w:r>
           </w:p>
         </w:tc>
@@ -8544,148 +8229,9 @@
         <w:pStyle w:val="FirstParagraph"/>
       </w:pPr>
       <w:r>
-        <w:rPr>
-          <w:b/>
-          <w:bCs/>
-        </w:rPr>
-        <w:t xml:space="preserve">MVP v1.0</w:t>
-      </w:r>
-      <w:r>
-        <w:rPr>
-          <w:rFonts w:hint="eastAsia"/>
-        </w:rPr>
-        <w:t xml:space="preserve">：Sequential</w:t>
-      </w:r>
-      <w:r>
-        <w:t xml:space="preserve"> </w:t>
-      </w:r>
-      <w:r>
-        <w:rPr>
-          <w:rFonts w:hint="eastAsia"/>
-        </w:rPr>
-        <w:t xml:space="preserve">编排</w:t>
-      </w:r>
-      <w:r>
-        <w:t xml:space="preserve"> + </w:t>
-      </w:r>
-      <w:r>
-        <w:rPr>
-          <w:rFonts w:hint="eastAsia"/>
-        </w:rPr>
-        <w:t xml:space="preserve">四件套</w:t>
-      </w:r>
-      <w:r>
-        <w:t xml:space="preserve"> + </w:t>
-      </w:r>
-      <w:r>
-        <w:rPr>
-          <w:rFonts w:hint="eastAsia"/>
-        </w:rPr>
-        <w:t xml:space="preserve">案例库</w:t>
-      </w:r>
-      <w:r>
-        <w:t xml:space="preserve"> + Word/PDF </w:t>
-      </w:r>
-      <w:r>
-        <w:rPr>
-          <w:rFonts w:hint="eastAsia"/>
-        </w:rPr>
-        <w:t xml:space="preserve">导出</w:t>
-      </w:r>
-      <w:r>
+        <w:t>已上线 v3.0：五 Agent 顺序编排 + 四件套 + 4 项 Skills + 邮箱认证 + 质量门禁 + Word/PDF/PPTX 导出</w:t>
         <w:br/>
-      </w:r>
-      <w:r>
-        <w:rPr>
-          <w:b/>
-          <w:bCs/>
-        </w:rPr>
-        <w:t xml:space="preserve">v1.1</w:t>
-      </w:r>
-      <w:r>
-        <w:rPr>
-          <w:rFonts w:hint="eastAsia"/>
-        </w:rPr>
-        <w:t xml:space="preserve">：GroupChat</w:t>
-      </w:r>
-      <w:r>
-        <w:t xml:space="preserve"> </w:t>
-      </w:r>
-      <w:r>
-        <w:rPr>
-          <w:rFonts w:hint="eastAsia"/>
-        </w:rPr>
-        <w:t xml:space="preserve">评审循环</w:t>
-      </w:r>
-      <w:r>
-        <w:t xml:space="preserve"> + </w:t>
-      </w:r>
-      <w:r>
-        <w:rPr>
-          <w:rFonts w:hint="eastAsia"/>
-        </w:rPr>
-        <w:t xml:space="preserve">局部</w:t>
-      </w:r>
-      <w:r>
-        <w:t xml:space="preserve"> Agent </w:t>
-      </w:r>
-      <w:r>
-        <w:rPr>
-          <w:rFonts w:hint="eastAsia"/>
-        </w:rPr>
-        <w:t xml:space="preserve">重跑</w:t>
-      </w:r>
-      <w:r>
-        <w:t xml:space="preserve"> + </w:t>
-      </w:r>
-      <w:r>
-        <w:rPr>
-          <w:rFonts w:hint="eastAsia"/>
-        </w:rPr>
-        <w:t xml:space="preserve">人机协同确认大纲</w:t>
-      </w:r>
-      <w:r>
-        <w:br/>
-      </w:r>
-      <w:r>
-        <w:rPr>
-          <w:b/>
-          <w:bCs/>
-        </w:rPr>
-        <w:t xml:space="preserve">v2.0</w:t>
-      </w:r>
-      <w:r>
-        <w:rPr>
-          <w:rFonts w:hint="eastAsia"/>
-        </w:rPr>
-        <w:t xml:space="preserve">：学科</w:t>
-      </w:r>
-      <w:r>
-        <w:t xml:space="preserve"> </w:t>
-      </w:r>
-      <w:r>
-        <w:rPr>
-          <w:rFonts w:hint="eastAsia"/>
-        </w:rPr>
-        <w:t xml:space="preserve">RAG、案例系列、LMS</w:t>
-      </w:r>
-      <w:r>
-        <w:t xml:space="preserve"> </w:t>
-      </w:r>
-      <w:r>
-        <w:rPr>
-          <w:rFonts w:hint="eastAsia"/>
-        </w:rPr>
-        <w:t xml:space="preserve">对接、Teachability</w:t>
-      </w:r>
-      <w:r>
-        <w:t xml:space="preserve"> </w:t>
-      </w:r>
-      <w:r>
-        <w:rPr>
-          <w:rFonts w:hint="eastAsia"/>
-        </w:rPr>
-        <w:t xml:space="preserve">记忆教师偏好</w:t>
+        <w:t>下一阶段：大纲确认、学科 RAG、案例系列、LMS 对接与品牌化课件模板</w:t>
       </w:r>
     </w:p>
     <w:p>
@@ -9335,6 +8881,39 @@
     </w:p>
     <w:bookmarkEnd w:id="40"/>
     <w:bookmarkEnd w:id="41"/>
+    <w:p>
+      <w:pPr>
+        <w:pStyle w:val="Heading1"/>
+      </w:pPr>
+      <w:r>
+        <w:t>当前上线设计同步（2026 年 8 月）</w:t>
+      </w:r>
+    </w:p>
+    <w:p>
+      <w:r>
+        <w:t>• 认证与额度：邮箱注册/登录，密码哈希存储；Refresh Token 使用有时效的 HttpOnly Cookie；按账号控制生成额度。</w:t>
+      </w:r>
+    </w:p>
+    <w:p>
+      <w:r>
+        <w:t>• 课程情境：学科、课程、案例类型、适用对象和难度共同约束生成；默认正文目标 2800 字，统计范围为背景、案例叙述与决策点的可见字符。</w:t>
+      </w:r>
+    </w:p>
+    <w:p>
+      <w:r>
+        <w:t>• 教学目标：完成情境后可一键生成 3 条；按案例类型应用金字塔、系统思维、3W1H 或伦理权衡；支持换一组和人工编辑。</w:t>
+      </w:r>
+    </w:p>
+    <w:p>
+      <w:r>
+        <w:t>• 质量与体验：保存和导出前校验正文 95%–105%、结构完整、目标对齐且无重复学科注释；页面与 DOCX/PDF 使用分区、标题、段距和分页优化长文阅读。</w:t>
+      </w:r>
+    </w:p>
+    <w:p>
+      <w:r>
+        <w:t>• 导出：Word、PDF、PPTX 文件均使用“课程主题_教学案例授课包（或课件）_V版本号”命名。</w:t>
+      </w:r>
+    </w:p>
     <w:sectPr>
       <w:footnotePr>
         <w:numRestart w:val="eachSect"/>

</xml_diff>

<commit_message>
feat: add traceable official visual materials
</commit_message>
<xml_diff>
--- a/docs/CaseAutoGenSystem-产品需求PRD.docx
+++ b/docs/CaseAutoGenSystem-产品需求PRD.docx
@@ -8912,6 +8912,29 @@
     <w:p>
       <w:r>
         <w:t>• 导出：Word、PDF、PPTX 文件均使用“课程主题_教学案例授课包（或课件）_V版本号”命名。</w:t>
+      </w:r>
+    </w:p>
+    <w:p>
+      <w:pPr>
+        <w:pStyle w:val="Heading1"/>
+      </w:pPr>
+      <w:r>
+        <w:t>官方视觉素材（2026 年 8 月增强）</w:t>
+      </w:r>
+    </w:p>
+    <w:p>
+      <w:r>
+        <w:t>• 系统按案例主题推荐经过目录审核的政府或机构官网图片，教师最多选择 6 张。</w:t>
+      </w:r>
+    </w:p>
+    <w:p>
+      <w:r>
+        <w:t>• 每张素材保留来源机构、原始页面、图片说明、发布日期或摄影者（如官网标注）以及权利提示。</w:t>
+      </w:r>
+    </w:p>
+    <w:p>
+      <w:r>
+        <w:t>• 已选素材同步进入案例详情、Word、PDF 与 PPTX；官网公开不等于无限转载，公开传播或商业再利用前需确认授权。</w:t>
       </w:r>
     </w:p>
     <w:sectPr>

</xml_diff>

<commit_message>
feat: upgrade PPTX classroom deck generation
</commit_message>
<xml_diff>
--- a/docs/CaseAutoGenSystem-产品需求PRD.docx
+++ b/docs/CaseAutoGenSystem-产品需求PRD.docx
@@ -8935,6 +8935,24 @@
     <w:p>
       <w:r>
         <w:t>• 已选素材同步进入案例详情、Word、PDF 与 PPTX；官网公开不等于无限转载，公开传播或商业再利用前需确认授权。</w:t>
+      </w:r>
+    </w:p>
+    <w:p>
+      <w:pPr>
+        <w:pStyle w:val="Heading1"/>
+      </w:pPr>
+      <w:r>
+        <w:t>专业 PPTX 课件增强（2026-08）</w:t>
+      </w:r>
+    </w:p>
+    <w:p>
+      <w:r>
+        <w:t>PPTX 生成由单一列表模板升级为语义化多版式引擎。系统依据案例内容自动生成大图封面、案例仪表盘、学习目标阶梯、章节转场、事件卡片、角色立场、决策检验框架、研讨任务、授课时间线、教师观察清单与目标对齐表。</w:t>
+      </w:r>
+    </w:p>
+    <w:p>
+      <w:r>
+        <w:t>用户可选择结构化讲授、课堂研讨或视觉叙事模式，并可控制是否生成逐页讲师备注。教师备注包含本页目的、建议时长、讲解或提问提示及转场建议；学生版继续隐藏教师专属内容。课件中的文本、图形、表格与官方图片可在 WPS 或 PowerPoint 中继续编辑。</w:t>
       </w:r>
     </w:p>
     <w:sectPr>

</xml_diff>